<commit_message>
Numeração do acórdão do AI 2353386 na origem: 2ª cópia em fls. 3422/3434 (com trânsito)
Co-Authored-By: Claude Opus 5.5 <noreply@anthropic.com>
Claude-Session: https://claude.ai/code/session_01TkrAgfLLUko9vjWUcVPKkP
</commit_message>
<xml_diff>
--- a/CLAUDE CODE - Auditoria_PenteFino_Memoriais_AI_2186351_v5.docx
+++ b/CLAUDE CODE - Auditoria_PenteFino_Memoriais_AI_2186351_v5.docx
@@ -218,6 +218,558 @@
           <w:iCs w:val="false"/>
         </w:rPr>
         <w:t xml:space="preserve"> leitura integral de "pag 55 a 173" (119 de 119 páginas); leitura dos cinco julgados novos (Apelação 0017993-79.2012; AREsp 1.539.138/SP e AgInt; AI 2143351-60.2024; EDcl Ap. 0019853-52.2024). Blocos reescritos: A6, B2, B3, B6, E2, G1, H4, H5, tabela de arquivos, faltantes e jurisprudência.</w:t>
+      </w:r>
+    </w:p>
+    <w:p>
+      <w:pPr>
+        <w:spacing w:after="40" w:line="276"/>
+        <w:jc w:val="center"/>
+      </w:pPr>
+      <w:r>
+        <w:rPr>
+          <w:rFonts w:ascii="Times New Roman" w:cs="Times New Roman" w:eastAsia="Times New Roman" w:hAnsi="Times New Roman"/>
+          <w:b/>
+          <w:bCs/>
+          <w:i w:val="false"/>
+          <w:iCs w:val="false"/>
+        </w:rPr>
+        <w:t xml:space="preserve">Nota de numeração (revisão de 28/09/2026): o acórdão do AI 2353386-61.2025 tem duas cópias na origem.</w:t>
+      </w:r>
+      <w:r>
+        <w:rPr>
+          <w:rFonts w:ascii="Times New Roman" w:cs="Times New Roman" w:eastAsia="Times New Roman" w:hAnsi="Times New Roman"/>
+          <w:b w:val="false"/>
+          <w:bCs w:val="false"/>
+          <w:i w:val="false"/>
+          <w:iCs w:val="false"/>
+        </w:rPr>
+        <w:t xml:space="preserve"> 🟩</w:t>
+      </w:r>
+    </w:p>
+    <w:tbl>
+      <w:tblPr>
+        <w:tblW w:type="dxa" w:w="9071"/>
+        <w:tblBorders>
+          <w:top w:val="single" w:color="auto" w:sz="4"/>
+          <w:left w:val="single" w:color="auto" w:sz="4"/>
+          <w:bottom w:val="single" w:color="auto" w:sz="4"/>
+          <w:right w:val="single" w:color="auto" w:sz="4"/>
+          <w:insideH w:val="single" w:color="auto" w:sz="4"/>
+          <w:insideV w:val="single" w:color="auto" w:sz="4"/>
+        </w:tblBorders>
+      </w:tblPr>
+      <w:tblGrid>
+        <w:gridCol w:w="471"/>
+        <w:gridCol w:w="1531"/>
+        <w:gridCol w:w="3534"/>
+        <w:gridCol w:w="3535"/>
+      </w:tblGrid>
+      <w:tr>
+        <w:trPr>
+          <w:cantSplit/>
+          <w:tblHeader/>
+        </w:trPr>
+        <w:tc>
+          <w:tcPr>
+            <w:tcW w:type="dxa" w:w="471"/>
+            <w:tcBorders>
+              <w:top w:val="single" w:color="808080" w:sz="4"/>
+              <w:left w:val="single" w:color="808080" w:sz="4"/>
+              <w:bottom w:val="single" w:color="808080" w:sz="4"/>
+              <w:right w:val="single" w:color="808080" w:sz="4"/>
+            </w:tcBorders>
+            <w:shd w:fill="D9E2F3" w:color="auto" w:val="clear"/>
+            <w:tcMar>
+              <w:top w:type="dxa" w:w="60"/>
+              <w:left w:type="dxa" w:w="90"/>
+              <w:bottom w:type="dxa" w:w="60"/>
+              <w:right w:type="dxa" w:w="90"/>
+            </w:tcMar>
+          </w:tcPr>
+          <w:p>
+            <w:pPr>
+              <w:spacing w:after="0" w:line="260"/>
+              <w:jc w:val="left"/>
+            </w:pPr>
+            <w:r>
+              <w:rPr>
+                <w:rFonts w:ascii="Times New Roman" w:cs="Times New Roman" w:eastAsia="Times New Roman" w:hAnsi="Times New Roman"/>
+                <w:b/>
+                <w:bCs/>
+                <w:i w:val="false"/>
+                <w:iCs w:val="false"/>
+                <w:sz w:val="19"/>
+                <w:szCs w:val="19"/>
+              </w:rPr>
+              <w:t xml:space="preserve">Cópia</w:t>
+            </w:r>
+          </w:p>
+        </w:tc>
+        <w:tc>
+          <w:tcPr>
+            <w:tcW w:type="dxa" w:w="1531"/>
+            <w:tcBorders>
+              <w:top w:val="single" w:color="808080" w:sz="4"/>
+              <w:left w:val="single" w:color="808080" w:sz="4"/>
+              <w:bottom w:val="single" w:color="808080" w:sz="4"/>
+              <w:right w:val="single" w:color="808080" w:sz="4"/>
+            </w:tcBorders>
+            <w:shd w:fill="D9E2F3" w:color="auto" w:val="clear"/>
+            <w:tcMar>
+              <w:top w:type="dxa" w:w="60"/>
+              <w:left w:type="dxa" w:w="90"/>
+              <w:bottom w:type="dxa" w:w="60"/>
+              <w:right w:type="dxa" w:w="90"/>
+            </w:tcMar>
+          </w:tcPr>
+          <w:p>
+            <w:pPr>
+              <w:spacing w:after="0" w:line="260"/>
+              <w:jc w:val="left"/>
+            </w:pPr>
+            <w:r>
+              <w:rPr>
+                <w:rFonts w:ascii="Times New Roman" w:cs="Times New Roman" w:eastAsia="Times New Roman" w:hAnsi="Times New Roman"/>
+                <w:b/>
+                <w:bCs/>
+                <w:i w:val="false"/>
+                <w:iCs w:val="false"/>
+                <w:sz w:val="19"/>
+                <w:szCs w:val="19"/>
+              </w:rPr>
+              <w:t xml:space="preserve">Folhas e-SAJ</w:t>
+            </w:r>
+          </w:p>
+        </w:tc>
+        <w:tc>
+          <w:tcPr>
+            <w:tcW w:type="dxa" w:w="3534"/>
+            <w:tcBorders>
+              <w:top w:val="single" w:color="808080" w:sz="4"/>
+              <w:left w:val="single" w:color="808080" w:sz="4"/>
+              <w:bottom w:val="single" w:color="808080" w:sz="4"/>
+              <w:right w:val="single" w:color="808080" w:sz="4"/>
+            </w:tcBorders>
+            <w:shd w:fill="D9E2F3" w:color="auto" w:val="clear"/>
+            <w:tcMar>
+              <w:top w:type="dxa" w:w="60"/>
+              <w:left w:type="dxa" w:w="90"/>
+              <w:bottom w:type="dxa" w:w="60"/>
+              <w:right w:type="dxa" w:w="90"/>
+            </w:tcMar>
+          </w:tcPr>
+          <w:p>
+            <w:pPr>
+              <w:spacing w:after="0" w:line="260"/>
+              <w:jc w:val="left"/>
+            </w:pPr>
+            <w:r>
+              <w:rPr>
+                <w:rFonts w:ascii="Times New Roman" w:cs="Times New Roman" w:eastAsia="Times New Roman" w:hAnsi="Times New Roman"/>
+                <w:b/>
+                <w:bCs/>
+                <w:i w:val="false"/>
+                <w:iCs w:val="false"/>
+                <w:sz w:val="19"/>
+                <w:szCs w:val="19"/>
+              </w:rPr>
+              <w:t xml:space="preserve">Quem juntou</w:t>
+            </w:r>
+          </w:p>
+        </w:tc>
+        <w:tc>
+          <w:tcPr>
+            <w:tcW w:type="dxa" w:w="3535"/>
+            <w:tcBorders>
+              <w:top w:val="single" w:color="808080" w:sz="4"/>
+              <w:left w:val="single" w:color="808080" w:sz="4"/>
+              <w:bottom w:val="single" w:color="808080" w:sz="4"/>
+              <w:right w:val="single" w:color="808080" w:sz="4"/>
+            </w:tcBorders>
+            <w:shd w:fill="D9E2F3" w:color="auto" w:val="clear"/>
+            <w:tcMar>
+              <w:top w:type="dxa" w:w="60"/>
+              <w:left w:type="dxa" w:w="90"/>
+              <w:bottom w:type="dxa" w:w="60"/>
+              <w:right w:type="dxa" w:w="90"/>
+            </w:tcMar>
+          </w:tcPr>
+          <w:p>
+            <w:pPr>
+              <w:spacing w:after="0" w:line="260"/>
+              <w:jc w:val="left"/>
+            </w:pPr>
+            <w:r>
+              <w:rPr>
+                <w:rFonts w:ascii="Times New Roman" w:cs="Times New Roman" w:eastAsia="Times New Roman" w:hAnsi="Times New Roman"/>
+                <w:b/>
+                <w:bCs/>
+                <w:i w:val="false"/>
+                <w:iCs w:val="false"/>
+                <w:sz w:val="19"/>
+                <w:szCs w:val="19"/>
+              </w:rPr>
+              <w:t xml:space="preserve">Conteúdo</w:t>
+            </w:r>
+          </w:p>
+        </w:tc>
+      </w:tr>
+      <w:tr>
+        <w:trPr>
+          <w:cantSplit/>
+          <w:tblHeader w:val="false"/>
+        </w:trPr>
+        <w:tc>
+          <w:tcPr>
+            <w:tcW w:type="dxa" w:w="471"/>
+            <w:tcBorders>
+              <w:top w:val="single" w:color="808080" w:sz="4"/>
+              <w:left w:val="single" w:color="808080" w:sz="4"/>
+              <w:bottom w:val="single" w:color="808080" w:sz="4"/>
+              <w:right w:val="single" w:color="808080" w:sz="4"/>
+            </w:tcBorders>
+            <w:tcMar>
+              <w:top w:type="dxa" w:w="60"/>
+              <w:left w:type="dxa" w:w="90"/>
+              <w:bottom w:type="dxa" w:w="60"/>
+              <w:right w:type="dxa" w:w="90"/>
+            </w:tcMar>
+          </w:tcPr>
+          <w:p>
+            <w:pPr>
+              <w:spacing w:after="0" w:line="260"/>
+              <w:jc w:val="left"/>
+            </w:pPr>
+            <w:r>
+              <w:rPr>
+                <w:rFonts w:ascii="Times New Roman" w:cs="Times New Roman" w:eastAsia="Times New Roman" w:hAnsi="Times New Roman"/>
+                <w:b w:val="false"/>
+                <w:bCs w:val="false"/>
+                <w:i w:val="false"/>
+                <w:iCs w:val="false"/>
+                <w:sz w:val="19"/>
+                <w:szCs w:val="19"/>
+              </w:rPr>
+              <w:t xml:space="preserve">1ª</w:t>
+            </w:r>
+          </w:p>
+        </w:tc>
+        <w:tc>
+          <w:tcPr>
+            <w:tcW w:type="dxa" w:w="1531"/>
+            <w:tcBorders>
+              <w:top w:val="single" w:color="808080" w:sz="4"/>
+              <w:left w:val="single" w:color="808080" w:sz="4"/>
+              <w:bottom w:val="single" w:color="808080" w:sz="4"/>
+              <w:right w:val="single" w:color="808080" w:sz="4"/>
+            </w:tcBorders>
+            <w:tcMar>
+              <w:top w:type="dxa" w:w="60"/>
+              <w:left w:type="dxa" w:w="90"/>
+              <w:bottom w:type="dxa" w:w="60"/>
+              <w:right w:type="dxa" w:w="90"/>
+            </w:tcMar>
+          </w:tcPr>
+          <w:p>
+            <w:pPr>
+              <w:spacing w:after="0" w:line="260"/>
+              <w:jc w:val="left"/>
+            </w:pPr>
+            <w:r>
+              <w:rPr>
+                <w:rFonts w:ascii="Times New Roman" w:cs="Times New Roman" w:eastAsia="Times New Roman" w:hAnsi="Times New Roman"/>
+                <w:b w:val="false"/>
+                <w:bCs w:val="false"/>
+                <w:i w:val="false"/>
+                <w:iCs w:val="false"/>
+                <w:sz w:val="19"/>
+                <w:szCs w:val="19"/>
+              </w:rPr>
+              <w:t xml:space="preserve">fls. 3395/3406</w:t>
+            </w:r>
+          </w:p>
+        </w:tc>
+        <w:tc>
+          <w:tcPr>
+            <w:tcW w:type="dxa" w:w="3534"/>
+            <w:tcBorders>
+              <w:top w:val="single" w:color="808080" w:sz="4"/>
+              <w:left w:val="single" w:color="808080" w:sz="4"/>
+              <w:bottom w:val="single" w:color="808080" w:sz="4"/>
+              <w:right w:val="single" w:color="808080" w:sz="4"/>
+            </w:tcBorders>
+            <w:tcMar>
+              <w:top w:type="dxa" w:w="60"/>
+              <w:left w:type="dxa" w:w="90"/>
+              <w:bottom w:type="dxa" w:w="60"/>
+              <w:right w:type="dxa" w:w="90"/>
+            </w:tcMar>
+          </w:tcPr>
+          <w:p>
+            <w:pPr>
+              <w:spacing w:after="0" w:line="260"/>
+              <w:jc w:val="left"/>
+            </w:pPr>
+            <w:r>
+              <w:rPr>
+                <w:rFonts w:ascii="Times New Roman" w:cs="Times New Roman" w:eastAsia="Times New Roman" w:hAnsi="Times New Roman"/>
+                <w:b w:val="false"/>
+                <w:bCs w:val="false"/>
+                <w:i w:val="false"/>
+                <w:iCs w:val="false"/>
+                <w:sz w:val="19"/>
+                <w:szCs w:val="19"/>
+              </w:rPr>
+              <w:t xml:space="preserve">exequentes (Dr. José Maria Barbosa), protocolo de 05/03/2026</w:t>
+            </w:r>
+          </w:p>
+        </w:tc>
+        <w:tc>
+          <w:tcPr>
+            <w:tcW w:type="dxa" w:w="3535"/>
+            <w:tcBorders>
+              <w:top w:val="single" w:color="808080" w:sz="4"/>
+              <w:left w:val="single" w:color="808080" w:sz="4"/>
+              <w:bottom w:val="single" w:color="808080" w:sz="4"/>
+              <w:right w:val="single" w:color="808080" w:sz="4"/>
+            </w:tcBorders>
+            <w:tcMar>
+              <w:top w:type="dxa" w:w="60"/>
+              <w:left w:type="dxa" w:w="90"/>
+              <w:bottom w:type="dxa" w:w="60"/>
+              <w:right w:type="dxa" w:w="90"/>
+            </w:tcMar>
+          </w:tcPr>
+          <w:p>
+            <w:pPr>
+              <w:spacing w:after="0" w:line="260"/>
+              <w:jc w:val="left"/>
+            </w:pPr>
+            <w:r>
+              <w:rPr>
+                <w:rFonts w:ascii="Times New Roman" w:cs="Times New Roman" w:eastAsia="Times New Roman" w:hAnsi="Times New Roman"/>
+                <w:b w:val="false"/>
+                <w:bCs w:val="false"/>
+                <w:i w:val="false"/>
+                <w:iCs w:val="false"/>
+                <w:sz w:val="19"/>
+                <w:szCs w:val="19"/>
+              </w:rPr>
+              <w:t xml:space="preserve">acórdão (12 páginas)</w:t>
+            </w:r>
+          </w:p>
+        </w:tc>
+      </w:tr>
+      <w:tr>
+        <w:trPr>
+          <w:cantSplit/>
+          <w:tblHeader w:val="false"/>
+        </w:trPr>
+        <w:tc>
+          <w:tcPr>
+            <w:tcW w:type="dxa" w:w="471"/>
+            <w:tcBorders>
+              <w:top w:val="single" w:color="808080" w:sz="4"/>
+              <w:left w:val="single" w:color="808080" w:sz="4"/>
+              <w:bottom w:val="single" w:color="808080" w:sz="4"/>
+              <w:right w:val="single" w:color="808080" w:sz="4"/>
+            </w:tcBorders>
+            <w:tcMar>
+              <w:top w:type="dxa" w:w="60"/>
+              <w:left w:type="dxa" w:w="90"/>
+              <w:bottom w:type="dxa" w:w="60"/>
+              <w:right w:type="dxa" w:w="90"/>
+            </w:tcMar>
+          </w:tcPr>
+          <w:p>
+            <w:pPr>
+              <w:spacing w:after="0" w:line="260"/>
+              <w:jc w:val="left"/>
+            </w:pPr>
+            <w:r>
+              <w:rPr>
+                <w:rFonts w:ascii="Times New Roman" w:cs="Times New Roman" w:eastAsia="Times New Roman" w:hAnsi="Times New Roman"/>
+                <w:b w:val="false"/>
+                <w:bCs w:val="false"/>
+                <w:i w:val="false"/>
+                <w:iCs w:val="false"/>
+                <w:sz w:val="19"/>
+                <w:szCs w:val="19"/>
+              </w:rPr>
+              <w:t xml:space="preserve">2ª</w:t>
+            </w:r>
+          </w:p>
+        </w:tc>
+        <w:tc>
+          <w:tcPr>
+            <w:tcW w:type="dxa" w:w="1531"/>
+            <w:tcBorders>
+              <w:top w:val="single" w:color="808080" w:sz="4"/>
+              <w:left w:val="single" w:color="808080" w:sz="4"/>
+              <w:bottom w:val="single" w:color="808080" w:sz="4"/>
+              <w:right w:val="single" w:color="808080" w:sz="4"/>
+            </w:tcBorders>
+            <w:tcMar>
+              <w:top w:type="dxa" w:w="60"/>
+              <w:left w:type="dxa" w:w="90"/>
+              <w:bottom w:type="dxa" w:w="60"/>
+              <w:right w:type="dxa" w:w="90"/>
+            </w:tcMar>
+          </w:tcPr>
+          <w:p>
+            <w:pPr>
+              <w:spacing w:after="0" w:line="260"/>
+              <w:jc w:val="left"/>
+            </w:pPr>
+            <w:r>
+              <w:rPr>
+                <w:rFonts w:ascii="Times New Roman" w:cs="Times New Roman" w:eastAsia="Times New Roman" w:hAnsi="Times New Roman"/>
+                <w:b w:val="false"/>
+                <w:bCs w:val="false"/>
+                <w:i w:val="false"/>
+                <w:iCs w:val="false"/>
+                <w:sz w:val="19"/>
+                <w:szCs w:val="19"/>
+              </w:rPr>
+              <w:t xml:space="preserve">fls. 3422/3433 e fls. 3434</w:t>
+            </w:r>
+          </w:p>
+        </w:tc>
+        <w:tc>
+          <w:tcPr>
+            <w:tcW w:type="dxa" w:w="3534"/>
+            <w:tcBorders>
+              <w:top w:val="single" w:color="808080" w:sz="4"/>
+              <w:left w:val="single" w:color="808080" w:sz="4"/>
+              <w:bottom w:val="single" w:color="808080" w:sz="4"/>
+              <w:right w:val="single" w:color="808080" w:sz="4"/>
+            </w:tcBorders>
+            <w:tcMar>
+              <w:top w:type="dxa" w:w="60"/>
+              <w:left w:type="dxa" w:w="90"/>
+              <w:bottom w:type="dxa" w:w="60"/>
+              <w:right w:type="dxa" w:w="90"/>
+            </w:tcMar>
+          </w:tcPr>
+          <w:p>
+            <w:pPr>
+              <w:spacing w:after="0" w:line="260"/>
+              <w:jc w:val="left"/>
+            </w:pPr>
+            <w:r>
+              <w:rPr>
+                <w:rFonts w:ascii="Times New Roman" w:cs="Times New Roman" w:eastAsia="Times New Roman" w:hAnsi="Times New Roman"/>
+                <w:b w:val="false"/>
+                <w:bCs w:val="false"/>
+                <w:i w:val="false"/>
+                <w:iCs w:val="false"/>
+                <w:sz w:val="19"/>
+                <w:szCs w:val="19"/>
+              </w:rPr>
+              <w:t xml:space="preserve">cartório, traslado liberado em 23/04/2026</w:t>
+            </w:r>
+          </w:p>
+        </w:tc>
+        <w:tc>
+          <w:tcPr>
+            <w:tcW w:type="dxa" w:w="3535"/>
+            <w:tcBorders>
+              <w:top w:val="single" w:color="808080" w:sz="4"/>
+              <w:left w:val="single" w:color="808080" w:sz="4"/>
+              <w:bottom w:val="single" w:color="808080" w:sz="4"/>
+              <w:right w:val="single" w:color="808080" w:sz="4"/>
+            </w:tcBorders>
+            <w:tcMar>
+              <w:top w:type="dxa" w:w="60"/>
+              <w:left w:type="dxa" w:w="90"/>
+              <w:bottom w:type="dxa" w:w="60"/>
+              <w:right w:type="dxa" w:w="90"/>
+            </w:tcMar>
+          </w:tcPr>
+          <w:p>
+            <w:pPr>
+              <w:spacing w:after="0" w:line="260"/>
+              <w:jc w:val="left"/>
+            </w:pPr>
+            <w:r>
+              <w:rPr>
+                <w:rFonts w:ascii="Times New Roman" w:cs="Times New Roman" w:eastAsia="Times New Roman" w:hAnsi="Times New Roman"/>
+                <w:b w:val="false"/>
+                <w:bCs w:val="false"/>
+                <w:i w:val="false"/>
+                <w:iCs w:val="false"/>
+                <w:sz w:val="19"/>
+                <w:szCs w:val="19"/>
+              </w:rPr>
+              <w:t xml:space="preserve">acórdão (12 páginas) e certidão de trânsito em julgado em </w:t>
+            </w:r>
+            <w:r>
+              <w:rPr>
+                <w:rFonts w:ascii="Times New Roman" w:cs="Times New Roman" w:eastAsia="Times New Roman" w:hAnsi="Times New Roman"/>
+                <w:b/>
+                <w:bCs/>
+                <w:i w:val="false"/>
+                <w:iCs w:val="false"/>
+                <w:sz w:val="19"/>
+                <w:szCs w:val="19"/>
+              </w:rPr>
+              <w:t xml:space="preserve">31/03/2026</w:t>
+            </w:r>
+            <w:r>
+              <w:rPr>
+                <w:rFonts w:ascii="Times New Roman" w:cs="Times New Roman" w:eastAsia="Times New Roman" w:hAnsi="Times New Roman"/>
+                <w:b w:val="false"/>
+                <w:bCs w:val="false"/>
+                <w:i w:val="false"/>
+                <w:iCs w:val="false"/>
+                <w:sz w:val="19"/>
+                <w:szCs w:val="19"/>
+              </w:rPr>
+              <w:t xml:space="preserve"> (fls. 3434)</w:t>
+            </w:r>
+          </w:p>
+        </w:tc>
+      </w:tr>
+    </w:tbl>
+    <w:p>
+      <w:pPr>
+        <w:spacing w:after="120"/>
+      </w:pPr>
+    </w:p>
+    <w:p>
+      <w:pPr>
+        <w:spacing w:after="120" w:line="360"/>
+        <w:jc w:val="both"/>
+      </w:pPr>
+      <w:r>
+        <w:rPr>
+          <w:rFonts w:ascii="Times New Roman" w:cs="Times New Roman" w:eastAsia="Times New Roman" w:hAnsi="Times New Roman"/>
+          <w:b w:val="false"/>
+          <w:bCs w:val="false"/>
+          <w:i w:val="false"/>
+          <w:iCs w:val="false"/>
+        </w:rPr>
+        <w:t xml:space="preserve">A decisão agravada cita "fls. 3422/3434", ou seja, a 2ª cópia. </w:t>
+      </w:r>
+      <w:r>
+        <w:rPr>
+          <w:rFonts w:ascii="Times New Roman" w:cs="Times New Roman" w:eastAsia="Times New Roman" w:hAnsi="Times New Roman"/>
+          <w:b/>
+          <w:bCs/>
+          <w:i w:val="false"/>
+          <w:iCs w:val="false"/>
+        </w:rPr>
+        <w:t xml:space="preserve">Na petição, usar a 2ª cópia.</w:t>
+      </w:r>
+      <w:r>
+        <w:rPr>
+          <w:rFonts w:ascii="Times New Roman" w:cs="Times New Roman" w:eastAsia="Times New Roman" w:hAnsi="Times New Roman"/>
+          <w:b w:val="false"/>
+          <w:bCs w:val="false"/>
+          <w:i w:val="false"/>
+          <w:iCs w:val="false"/>
+        </w:rPr>
+        <w:t xml:space="preserve"> Correspondência: fls. 3395 = 3422; 3403 = 3430; 3404 = 3431; 3405 = 3432; 3406 = 3433. Onde esta auditoria cita fls. 3395/3406, somar 27 para obter a folha da 2ª cópia.</w:t>
       </w:r>
     </w:p>
     <w:p>
@@ -23507,7 +24059,7 @@
           <w:i w:val="false"/>
           <w:iCs w:val="false"/>
         </w:rPr>
-        <w:t xml:space="preserve"> (j. 04/03/2026, v.u., Heraldo de Oliveira e Giaquinto; Registro 2026.0000169763; fls. 3395/3403 e-SAJ): a Relatora adota a decisão de 1º grau ("As conclusões a que chega são exatamente as mesmas"), que diz: "A decisão de homologação (…) irrecorrível em seu mérito após o julgamento do agravo, encontra-se sob o manto da </w:t>
+        <w:t xml:space="preserve"> (j. 04/03/2026, v.u., Heraldo de Oliveira e Giaquinto; Registro 2026.0000169763; fls. 3395/3403 e-SAJ, 1ª cópia = fls. 3422/3430 e-SAJ, 2ª cópia; trânsito em 31/03/2026, fls. 3434): a Relatora adota a decisão de 1º grau ("As conclusões a que chega são exatamente as mesmas"), que diz: "A decisão de homologação (…) irrecorrível em seu mérito após o julgamento do agravo, encontra-se sob o manto da </w:t>
       </w:r>
       <w:r>
         <w:rPr>
@@ -23587,7 +24139,7 @@
           <w:i w:val="false"/>
           <w:iCs w:val="false"/>
         </w:rPr>
-        <w:t xml:space="preserve"> fls. 3404/3406 e-SAJ lidas em imagem. A Relatora manteve a multa de 5% por litigância de má-fé imposta ao executado: "havendo tentativa de induzir o juiz a erro, com a alteração da verdade dos fatos (…), que tentava suspender o leilão e protelar o ato expropriatório, o que configura conduta desleal tipificada no art. 80, incisos II e IV do CPC. Não é ainda o caso de redução da multa, uma vez que houve reincidência em sua conduta, que cabe ser coibida pelo Poder Judiciário" (fls. 3404/3405 e-SAJ). Também manteve a Tabela Prática do TJSP em vez do IGP-M e negou provimento (fls. 3406). </w:t>
+        <w:t xml:space="preserve"> fls. 3404/3406 e-SAJ lidas em imagem. A Relatora manteve a multa de 5% por litigância de má-fé imposta ao executado: "havendo tentativa de induzir o juiz a erro, com a alteração da verdade dos fatos (…), que tentava suspender o leilão e protelar o ato expropriatório, o que configura conduta desleal tipificada no art. 80, incisos II e IV do CPC. Não é ainda o caso de redução da multa, uma vez que houve reincidência em sua conduta, que cabe ser coibida pelo Poder Judiciário" (fls. 3404/3405 e-SAJ = fls. 3431/3432 da 2ª cópia). Também manteve a Tabela Prática do TJSP em vez do IGP-M e negou provimento (fls. 3406). </w:t>
       </w:r>
       <w:r>
         <w:rPr>
@@ -23627,7 +24179,7 @@
           <w:i w:val="false"/>
           <w:iCs w:val="false"/>
         </w:rPr>
-        <w:t xml:space="preserve">", mas a multa foi imposta ao executado Espólio (fls. 3403: "condeno o executado ESPÓLIO DE SÉRGIO BUENO PEREIRA DA CUNHA ao pagamento de multa"). É lapso material do acórdão. Nos memoriais, transcrever com "[sic]" ou citar só o trecho de fls. 3403 e a expressão "reincidência em sua conduta".</w:t>
+        <w:t xml:space="preserve">", mas a multa foi imposta ao executado Espólio (fls. 3403 = 3430 da 2ª cópia: "condeno o executado ESPÓLIO DE SÉRGIO BUENO PEREIRA DA CUNHA ao pagamento de multa"). É lapso material do acórdão. Nos memoriais, transcrever com "[sic]" ou citar só o trecho de fls. 3430 e-SAJ (2ª cópia) e a expressão "reincidência em sua conduta".</w:t>
       </w:r>
     </w:p>
     <w:p>
@@ -37567,11 +38119,11 @@
         </w:tblBorders>
       </w:tblPr>
       <w:tblGrid>
-        <w:gridCol w:w="2212"/>
-        <w:gridCol w:w="1253"/>
-        <w:gridCol w:w="1991"/>
-        <w:gridCol w:w="2212"/>
-        <w:gridCol w:w="1403"/>
+        <w:gridCol w:w="2194"/>
+        <w:gridCol w:w="1243"/>
+        <w:gridCol w:w="1975"/>
+        <w:gridCol w:w="2194"/>
+        <w:gridCol w:w="1465"/>
       </w:tblGrid>
       <w:tr>
         <w:trPr>
@@ -37580,7 +38132,7 @@
         </w:trPr>
         <w:tc>
           <w:tcPr>
-            <w:tcW w:type="dxa" w:w="2212"/>
+            <w:tcW w:type="dxa" w:w="2194"/>
             <w:tcBorders>
               <w:top w:val="single" w:color="808080" w:sz="4"/>
               <w:left w:val="single" w:color="808080" w:sz="4"/>
@@ -37616,7 +38168,7 @@
         </w:tc>
         <w:tc>
           <w:tcPr>
-            <w:tcW w:type="dxa" w:w="1253"/>
+            <w:tcW w:type="dxa" w:w="1243"/>
             <w:tcBorders>
               <w:top w:val="single" w:color="808080" w:sz="4"/>
               <w:left w:val="single" w:color="808080" w:sz="4"/>
@@ -37652,7 +38204,7 @@
         </w:tc>
         <w:tc>
           <w:tcPr>
-            <w:tcW w:type="dxa" w:w="1991"/>
+            <w:tcW w:type="dxa" w:w="1975"/>
             <w:tcBorders>
               <w:top w:val="single" w:color="808080" w:sz="4"/>
               <w:left w:val="single" w:color="808080" w:sz="4"/>
@@ -37688,7 +38240,7 @@
         </w:tc>
         <w:tc>
           <w:tcPr>
-            <w:tcW w:type="dxa" w:w="2212"/>
+            <w:tcW w:type="dxa" w:w="2194"/>
             <w:tcBorders>
               <w:top w:val="single" w:color="808080" w:sz="4"/>
               <w:left w:val="single" w:color="808080" w:sz="4"/>
@@ -37724,7 +38276,7 @@
         </w:tc>
         <w:tc>
           <w:tcPr>
-            <w:tcW w:type="dxa" w:w="1403"/>
+            <w:tcW w:type="dxa" w:w="1465"/>
             <w:tcBorders>
               <w:top w:val="single" w:color="808080" w:sz="4"/>
               <w:left w:val="single" w:color="808080" w:sz="4"/>
@@ -37766,7 +38318,7 @@
         </w:trPr>
         <w:tc>
           <w:tcPr>
-            <w:tcW w:type="dxa" w:w="2212"/>
+            <w:tcW w:type="dxa" w:w="2194"/>
             <w:tcBorders>
               <w:top w:val="single" w:color="808080" w:sz="4"/>
               <w:left w:val="single" w:color="808080" w:sz="4"/>
@@ -37801,7 +38353,7 @@
         </w:tc>
         <w:tc>
           <w:tcPr>
-            <w:tcW w:type="dxa" w:w="1253"/>
+            <w:tcW w:type="dxa" w:w="1243"/>
             <w:tcBorders>
               <w:top w:val="single" w:color="808080" w:sz="4"/>
               <w:left w:val="single" w:color="808080" w:sz="4"/>
@@ -37836,7 +38388,7 @@
         </w:tc>
         <w:tc>
           <w:tcPr>
-            <w:tcW w:type="dxa" w:w="1991"/>
+            <w:tcW w:type="dxa" w:w="1975"/>
             <w:tcBorders>
               <w:top w:val="single" w:color="808080" w:sz="4"/>
               <w:left w:val="single" w:color="808080" w:sz="4"/>
@@ -37871,7 +38423,7 @@
         </w:tc>
         <w:tc>
           <w:tcPr>
-            <w:tcW w:type="dxa" w:w="2212"/>
+            <w:tcW w:type="dxa" w:w="2194"/>
             <w:tcBorders>
               <w:top w:val="single" w:color="808080" w:sz="4"/>
               <w:left w:val="single" w:color="808080" w:sz="4"/>
@@ -37906,7 +38458,7 @@
         </w:tc>
         <w:tc>
           <w:tcPr>
-            <w:tcW w:type="dxa" w:w="1403"/>
+            <w:tcW w:type="dxa" w:w="1465"/>
             <w:tcBorders>
               <w:top w:val="single" w:color="808080" w:sz="4"/>
               <w:left w:val="single" w:color="808080" w:sz="4"/>
@@ -37947,7 +38499,7 @@
         </w:trPr>
         <w:tc>
           <w:tcPr>
-            <w:tcW w:type="dxa" w:w="2212"/>
+            <w:tcW w:type="dxa" w:w="2194"/>
             <w:tcBorders>
               <w:top w:val="single" w:color="808080" w:sz="4"/>
               <w:left w:val="single" w:color="808080" w:sz="4"/>
@@ -37994,7 +38546,7 @@
         </w:tc>
         <w:tc>
           <w:tcPr>
-            <w:tcW w:type="dxa" w:w="1253"/>
+            <w:tcW w:type="dxa" w:w="1243"/>
             <w:tcBorders>
               <w:top w:val="single" w:color="808080" w:sz="4"/>
               <w:left w:val="single" w:color="808080" w:sz="4"/>
@@ -38029,7 +38581,7 @@
         </w:tc>
         <w:tc>
           <w:tcPr>
-            <w:tcW w:type="dxa" w:w="1991"/>
+            <w:tcW w:type="dxa" w:w="1975"/>
             <w:tcBorders>
               <w:top w:val="single" w:color="808080" w:sz="4"/>
               <w:left w:val="single" w:color="808080" w:sz="4"/>
@@ -38064,7 +38616,7 @@
         </w:tc>
         <w:tc>
           <w:tcPr>
-            <w:tcW w:type="dxa" w:w="2212"/>
+            <w:tcW w:type="dxa" w:w="2194"/>
             <w:tcBorders>
               <w:top w:val="single" w:color="808080" w:sz="4"/>
               <w:left w:val="single" w:color="808080" w:sz="4"/>
@@ -38099,7 +38651,7 @@
         </w:tc>
         <w:tc>
           <w:tcPr>
-            <w:tcW w:type="dxa" w:w="1403"/>
+            <w:tcW w:type="dxa" w:w="1465"/>
             <w:tcBorders>
               <w:top w:val="single" w:color="808080" w:sz="4"/>
               <w:left w:val="single" w:color="808080" w:sz="4"/>
@@ -38140,7 +38692,7 @@
         </w:trPr>
         <w:tc>
           <w:tcPr>
-            <w:tcW w:type="dxa" w:w="2212"/>
+            <w:tcW w:type="dxa" w:w="2194"/>
             <w:tcBorders>
               <w:top w:val="single" w:color="808080" w:sz="4"/>
               <w:left w:val="single" w:color="808080" w:sz="4"/>
@@ -38175,7 +38727,7 @@
         </w:tc>
         <w:tc>
           <w:tcPr>
-            <w:tcW w:type="dxa" w:w="1253"/>
+            <w:tcW w:type="dxa" w:w="1243"/>
             <w:tcBorders>
               <w:top w:val="single" w:color="808080" w:sz="4"/>
               <w:left w:val="single" w:color="808080" w:sz="4"/>
@@ -38210,7 +38762,7 @@
         </w:tc>
         <w:tc>
           <w:tcPr>
-            <w:tcW w:type="dxa" w:w="1991"/>
+            <w:tcW w:type="dxa" w:w="1975"/>
             <w:tcBorders>
               <w:top w:val="single" w:color="808080" w:sz="4"/>
               <w:left w:val="single" w:color="808080" w:sz="4"/>
@@ -38245,7 +38797,7 @@
         </w:tc>
         <w:tc>
           <w:tcPr>
-            <w:tcW w:type="dxa" w:w="2212"/>
+            <w:tcW w:type="dxa" w:w="2194"/>
             <w:tcBorders>
               <w:top w:val="single" w:color="808080" w:sz="4"/>
               <w:left w:val="single" w:color="808080" w:sz="4"/>
@@ -38280,7 +38832,7 @@
         </w:tc>
         <w:tc>
           <w:tcPr>
-            <w:tcW w:type="dxa" w:w="1403"/>
+            <w:tcW w:type="dxa" w:w="1465"/>
             <w:tcBorders>
               <w:top w:val="single" w:color="808080" w:sz="4"/>
               <w:left w:val="single" w:color="808080" w:sz="4"/>
@@ -38321,7 +38873,7 @@
         </w:trPr>
         <w:tc>
           <w:tcPr>
-            <w:tcW w:type="dxa" w:w="2212"/>
+            <w:tcW w:type="dxa" w:w="2194"/>
             <w:tcBorders>
               <w:top w:val="single" w:color="808080" w:sz="4"/>
               <w:left w:val="single" w:color="808080" w:sz="4"/>
@@ -38356,7 +38908,7 @@
         </w:tc>
         <w:tc>
           <w:tcPr>
-            <w:tcW w:type="dxa" w:w="1253"/>
+            <w:tcW w:type="dxa" w:w="1243"/>
             <w:tcBorders>
               <w:top w:val="single" w:color="808080" w:sz="4"/>
               <w:left w:val="single" w:color="808080" w:sz="4"/>
@@ -38391,7 +38943,7 @@
         </w:tc>
         <w:tc>
           <w:tcPr>
-            <w:tcW w:type="dxa" w:w="1991"/>
+            <w:tcW w:type="dxa" w:w="1975"/>
             <w:tcBorders>
               <w:top w:val="single" w:color="808080" w:sz="4"/>
               <w:left w:val="single" w:color="808080" w:sz="4"/>
@@ -38426,7 +38978,7 @@
         </w:tc>
         <w:tc>
           <w:tcPr>
-            <w:tcW w:type="dxa" w:w="2212"/>
+            <w:tcW w:type="dxa" w:w="2194"/>
             <w:tcBorders>
               <w:top w:val="single" w:color="808080" w:sz="4"/>
               <w:left w:val="single" w:color="808080" w:sz="4"/>
@@ -38461,7 +39013,7 @@
         </w:tc>
         <w:tc>
           <w:tcPr>
-            <w:tcW w:type="dxa" w:w="1403"/>
+            <w:tcW w:type="dxa" w:w="1465"/>
             <w:tcBorders>
               <w:top w:val="single" w:color="808080" w:sz="4"/>
               <w:left w:val="single" w:color="808080" w:sz="4"/>
@@ -38502,7 +39054,7 @@
         </w:trPr>
         <w:tc>
           <w:tcPr>
-            <w:tcW w:type="dxa" w:w="2212"/>
+            <w:tcW w:type="dxa" w:w="2194"/>
             <w:tcBorders>
               <w:top w:val="single" w:color="808080" w:sz="4"/>
               <w:left w:val="single" w:color="808080" w:sz="4"/>
@@ -38537,7 +39089,7 @@
         </w:tc>
         <w:tc>
           <w:tcPr>
-            <w:tcW w:type="dxa" w:w="1253"/>
+            <w:tcW w:type="dxa" w:w="1243"/>
             <w:tcBorders>
               <w:top w:val="single" w:color="808080" w:sz="4"/>
               <w:left w:val="single" w:color="808080" w:sz="4"/>
@@ -38572,7 +39124,7 @@
         </w:tc>
         <w:tc>
           <w:tcPr>
-            <w:tcW w:type="dxa" w:w="1991"/>
+            <w:tcW w:type="dxa" w:w="1975"/>
             <w:tcBorders>
               <w:top w:val="single" w:color="808080" w:sz="4"/>
               <w:left w:val="single" w:color="808080" w:sz="4"/>
@@ -38607,7 +39159,7 @@
         </w:tc>
         <w:tc>
           <w:tcPr>
-            <w:tcW w:type="dxa" w:w="2212"/>
+            <w:tcW w:type="dxa" w:w="2194"/>
             <w:tcBorders>
               <w:top w:val="single" w:color="808080" w:sz="4"/>
               <w:left w:val="single" w:color="808080" w:sz="4"/>
@@ -38642,7 +39194,7 @@
         </w:tc>
         <w:tc>
           <w:tcPr>
-            <w:tcW w:type="dxa" w:w="1403"/>
+            <w:tcW w:type="dxa" w:w="1465"/>
             <w:tcBorders>
               <w:top w:val="single" w:color="808080" w:sz="4"/>
               <w:left w:val="single" w:color="808080" w:sz="4"/>
@@ -38683,7 +39235,7 @@
         </w:trPr>
         <w:tc>
           <w:tcPr>
-            <w:tcW w:type="dxa" w:w="2212"/>
+            <w:tcW w:type="dxa" w:w="2194"/>
             <w:tcBorders>
               <w:top w:val="single" w:color="808080" w:sz="4"/>
               <w:left w:val="single" w:color="808080" w:sz="4"/>
@@ -38718,7 +39270,7 @@
         </w:tc>
         <w:tc>
           <w:tcPr>
-            <w:tcW w:type="dxa" w:w="1253"/>
+            <w:tcW w:type="dxa" w:w="1243"/>
             <w:tcBorders>
               <w:top w:val="single" w:color="808080" w:sz="4"/>
               <w:left w:val="single" w:color="808080" w:sz="4"/>
@@ -38753,7 +39305,7 @@
         </w:tc>
         <w:tc>
           <w:tcPr>
-            <w:tcW w:type="dxa" w:w="1991"/>
+            <w:tcW w:type="dxa" w:w="1975"/>
             <w:tcBorders>
               <w:top w:val="single" w:color="808080" w:sz="4"/>
               <w:left w:val="single" w:color="808080" w:sz="4"/>
@@ -38788,71 +39340,71 @@
         </w:tc>
         <w:tc>
           <w:tcPr>
-            <w:tcW w:type="dxa" w:w="2212"/>
-            <w:tcBorders>
-              <w:top w:val="single" w:color="808080" w:sz="4"/>
-              <w:left w:val="single" w:color="808080" w:sz="4"/>
-              <w:bottom w:val="single" w:color="808080" w:sz="4"/>
-              <w:right w:val="single" w:color="808080" w:sz="4"/>
-            </w:tcBorders>
-            <w:tcMar>
-              <w:top w:type="dxa" w:w="60"/>
-              <w:left w:type="dxa" w:w="90"/>
-              <w:bottom w:type="dxa" w:w="60"/>
-              <w:right w:type="dxa" w:w="90"/>
-            </w:tcMar>
-          </w:tcPr>
-          <w:p>
-            <w:pPr>
-              <w:spacing w:after="0" w:line="260"/>
-              <w:jc w:val="left"/>
-            </w:pPr>
-            <w:r>
-              <w:rPr>
-                <w:rFonts w:ascii="Times New Roman" w:cs="Times New Roman" w:eastAsia="Times New Roman" w:hAnsi="Times New Roman"/>
-                <w:b w:val="false"/>
-                <w:bCs w:val="false"/>
-                <w:i w:val="false"/>
-                <w:iCs w:val="false"/>
-                <w:sz w:val="19"/>
-                <w:szCs w:val="19"/>
-              </w:rPr>
-              <w:t xml:space="preserve">E1: citar fls. 3403 e usar [sic]</w:t>
-            </w:r>
-          </w:p>
-        </w:tc>
-        <w:tc>
-          <w:tcPr>
-            <w:tcW w:type="dxa" w:w="1403"/>
-            <w:tcBorders>
-              <w:top w:val="single" w:color="808080" w:sz="4"/>
-              <w:left w:val="single" w:color="808080" w:sz="4"/>
-              <w:bottom w:val="single" w:color="808080" w:sz="4"/>
-              <w:right w:val="single" w:color="808080" w:sz="4"/>
-            </w:tcBorders>
-            <w:tcMar>
-              <w:top w:type="dxa" w:w="60"/>
-              <w:left w:type="dxa" w:w="90"/>
-              <w:bottom w:type="dxa" w:w="60"/>
-              <w:right w:type="dxa" w:w="90"/>
-            </w:tcMar>
-          </w:tcPr>
-          <w:p>
-            <w:pPr>
-              <w:spacing w:after="0" w:line="260"/>
-              <w:jc w:val="left"/>
-            </w:pPr>
-            <w:r>
-              <w:rPr>
-                <w:rFonts w:ascii="Times New Roman" w:cs="Times New Roman" w:eastAsia="Times New Roman" w:hAnsi="Times New Roman"/>
-                <w:b w:val="false"/>
-                <w:bCs w:val="false"/>
-                <w:i w:val="false"/>
-                <w:iCs w:val="false"/>
-                <w:sz w:val="19"/>
-                <w:szCs w:val="19"/>
-              </w:rPr>
-              <w:t xml:space="preserve">fls. 3403/3404</w:t>
+            <w:tcW w:type="dxa" w:w="2194"/>
+            <w:tcBorders>
+              <w:top w:val="single" w:color="808080" w:sz="4"/>
+              <w:left w:val="single" w:color="808080" w:sz="4"/>
+              <w:bottom w:val="single" w:color="808080" w:sz="4"/>
+              <w:right w:val="single" w:color="808080" w:sz="4"/>
+            </w:tcBorders>
+            <w:tcMar>
+              <w:top w:type="dxa" w:w="60"/>
+              <w:left w:type="dxa" w:w="90"/>
+              <w:bottom w:type="dxa" w:w="60"/>
+              <w:right w:type="dxa" w:w="90"/>
+            </w:tcMar>
+          </w:tcPr>
+          <w:p>
+            <w:pPr>
+              <w:spacing w:after="0" w:line="260"/>
+              <w:jc w:val="left"/>
+            </w:pPr>
+            <w:r>
+              <w:rPr>
+                <w:rFonts w:ascii="Times New Roman" w:cs="Times New Roman" w:eastAsia="Times New Roman" w:hAnsi="Times New Roman"/>
+                <w:b w:val="false"/>
+                <w:bCs w:val="false"/>
+                <w:i w:val="false"/>
+                <w:iCs w:val="false"/>
+                <w:sz w:val="19"/>
+                <w:szCs w:val="19"/>
+              </w:rPr>
+              <w:t xml:space="preserve">E1: citar fls. 3430 (2ª cópia) e usar [sic]</w:t>
+            </w:r>
+          </w:p>
+        </w:tc>
+        <w:tc>
+          <w:tcPr>
+            <w:tcW w:type="dxa" w:w="1465"/>
+            <w:tcBorders>
+              <w:top w:val="single" w:color="808080" w:sz="4"/>
+              <w:left w:val="single" w:color="808080" w:sz="4"/>
+              <w:bottom w:val="single" w:color="808080" w:sz="4"/>
+              <w:right w:val="single" w:color="808080" w:sz="4"/>
+            </w:tcBorders>
+            <w:tcMar>
+              <w:top w:type="dxa" w:w="60"/>
+              <w:left w:type="dxa" w:w="90"/>
+              <w:bottom w:type="dxa" w:w="60"/>
+              <w:right w:type="dxa" w:w="90"/>
+            </w:tcMar>
+          </w:tcPr>
+          <w:p>
+            <w:pPr>
+              <w:spacing w:after="0" w:line="260"/>
+              <w:jc w:val="left"/>
+            </w:pPr>
+            <w:r>
+              <w:rPr>
+                <w:rFonts w:ascii="Times New Roman" w:cs="Times New Roman" w:eastAsia="Times New Roman" w:hAnsi="Times New Roman"/>
+                <w:b w:val="false"/>
+                <w:bCs w:val="false"/>
+                <w:i w:val="false"/>
+                <w:iCs w:val="false"/>
+                <w:sz w:val="19"/>
+                <w:szCs w:val="19"/>
+              </w:rPr>
+              <w:t xml:space="preserve">fls. 3430/3431 (= 3403/3404 da 1ª cópia)</w:t>
             </w:r>
           </w:p>
         </w:tc>
@@ -38864,7 +39416,7 @@
         </w:trPr>
         <w:tc>
           <w:tcPr>
-            <w:tcW w:type="dxa" w:w="2212"/>
+            <w:tcW w:type="dxa" w:w="2194"/>
             <w:tcBorders>
               <w:top w:val="single" w:color="808080" w:sz="4"/>
               <w:left w:val="single" w:color="808080" w:sz="4"/>
@@ -38911,7 +39463,7 @@
         </w:tc>
         <w:tc>
           <w:tcPr>
-            <w:tcW w:type="dxa" w:w="1253"/>
+            <w:tcW w:type="dxa" w:w="1243"/>
             <w:tcBorders>
               <w:top w:val="single" w:color="808080" w:sz="4"/>
               <w:left w:val="single" w:color="808080" w:sz="4"/>
@@ -38946,7 +39498,7 @@
         </w:tc>
         <w:tc>
           <w:tcPr>
-            <w:tcW w:type="dxa" w:w="1991"/>
+            <w:tcW w:type="dxa" w:w="1975"/>
             <w:tcBorders>
               <w:top w:val="single" w:color="808080" w:sz="4"/>
               <w:left w:val="single" w:color="808080" w:sz="4"/>
@@ -38981,7 +39533,7 @@
         </w:tc>
         <w:tc>
           <w:tcPr>
-            <w:tcW w:type="dxa" w:w="2212"/>
+            <w:tcW w:type="dxa" w:w="2194"/>
             <w:tcBorders>
               <w:top w:val="single" w:color="808080" w:sz="4"/>
               <w:left w:val="single" w:color="808080" w:sz="4"/>
@@ -39016,7 +39568,7 @@
         </w:tc>
         <w:tc>
           <w:tcPr>
-            <w:tcW w:type="dxa" w:w="1403"/>
+            <w:tcW w:type="dxa" w:w="1465"/>
             <w:tcBorders>
               <w:top w:val="single" w:color="808080" w:sz="4"/>
               <w:left w:val="single" w:color="808080" w:sz="4"/>
@@ -39057,7 +39609,7 @@
         </w:trPr>
         <w:tc>
           <w:tcPr>
-            <w:tcW w:type="dxa" w:w="2212"/>
+            <w:tcW w:type="dxa" w:w="2194"/>
             <w:tcBorders>
               <w:top w:val="single" w:color="808080" w:sz="4"/>
               <w:left w:val="single" w:color="808080" w:sz="4"/>
@@ -39092,7 +39644,7 @@
         </w:tc>
         <w:tc>
           <w:tcPr>
-            <w:tcW w:type="dxa" w:w="1253"/>
+            <w:tcW w:type="dxa" w:w="1243"/>
             <w:tcBorders>
               <w:top w:val="single" w:color="808080" w:sz="4"/>
               <w:left w:val="single" w:color="808080" w:sz="4"/>
@@ -39127,7 +39679,7 @@
         </w:tc>
         <w:tc>
           <w:tcPr>
-            <w:tcW w:type="dxa" w:w="1991"/>
+            <w:tcW w:type="dxa" w:w="1975"/>
             <w:tcBorders>
               <w:top w:val="single" w:color="808080" w:sz="4"/>
               <w:left w:val="single" w:color="808080" w:sz="4"/>
@@ -39162,7 +39714,7 @@
         </w:tc>
         <w:tc>
           <w:tcPr>
-            <w:tcW w:type="dxa" w:w="2212"/>
+            <w:tcW w:type="dxa" w:w="2194"/>
             <w:tcBorders>
               <w:top w:val="single" w:color="808080" w:sz="4"/>
               <w:left w:val="single" w:color="808080" w:sz="4"/>
@@ -39197,7 +39749,7 @@
         </w:tc>
         <w:tc>
           <w:tcPr>
-            <w:tcW w:type="dxa" w:w="1403"/>
+            <w:tcW w:type="dxa" w:w="1465"/>
             <w:tcBorders>
               <w:top w:val="single" w:color="808080" w:sz="4"/>
               <w:left w:val="single" w:color="808080" w:sz="4"/>
@@ -39238,7 +39790,7 @@
         </w:trPr>
         <w:tc>
           <w:tcPr>
-            <w:tcW w:type="dxa" w:w="2212"/>
+            <w:tcW w:type="dxa" w:w="2194"/>
             <w:tcBorders>
               <w:top w:val="single" w:color="808080" w:sz="4"/>
               <w:left w:val="single" w:color="808080" w:sz="4"/>
@@ -39273,7 +39825,7 @@
         </w:tc>
         <w:tc>
           <w:tcPr>
-            <w:tcW w:type="dxa" w:w="1253"/>
+            <w:tcW w:type="dxa" w:w="1243"/>
             <w:tcBorders>
               <w:top w:val="single" w:color="808080" w:sz="4"/>
               <w:left w:val="single" w:color="808080" w:sz="4"/>
@@ -39308,7 +39860,7 @@
         </w:tc>
         <w:tc>
           <w:tcPr>
-            <w:tcW w:type="dxa" w:w="1991"/>
+            <w:tcW w:type="dxa" w:w="1975"/>
             <w:tcBorders>
               <w:top w:val="single" w:color="808080" w:sz="4"/>
               <w:left w:val="single" w:color="808080" w:sz="4"/>
@@ -39343,7 +39895,7 @@
         </w:tc>
         <w:tc>
           <w:tcPr>
-            <w:tcW w:type="dxa" w:w="2212"/>
+            <w:tcW w:type="dxa" w:w="2194"/>
             <w:tcBorders>
               <w:top w:val="single" w:color="808080" w:sz="4"/>
               <w:left w:val="single" w:color="808080" w:sz="4"/>
@@ -39378,7 +39930,7 @@
         </w:tc>
         <w:tc>
           <w:tcPr>
-            <w:tcW w:type="dxa" w:w="1403"/>
+            <w:tcW w:type="dxa" w:w="1465"/>
             <w:tcBorders>
               <w:top w:val="single" w:color="808080" w:sz="4"/>
               <w:left w:val="single" w:color="808080" w:sz="4"/>
@@ -39419,7 +39971,7 @@
         </w:trPr>
         <w:tc>
           <w:tcPr>
-            <w:tcW w:type="dxa" w:w="2212"/>
+            <w:tcW w:type="dxa" w:w="2194"/>
             <w:tcBorders>
               <w:top w:val="single" w:color="808080" w:sz="4"/>
               <w:left w:val="single" w:color="808080" w:sz="4"/>
@@ -39454,7 +40006,7 @@
         </w:tc>
         <w:tc>
           <w:tcPr>
-            <w:tcW w:type="dxa" w:w="1253"/>
+            <w:tcW w:type="dxa" w:w="1243"/>
             <w:tcBorders>
               <w:top w:val="single" w:color="808080" w:sz="4"/>
               <w:left w:val="single" w:color="808080" w:sz="4"/>
@@ -39489,7 +40041,7 @@
         </w:tc>
         <w:tc>
           <w:tcPr>
-            <w:tcW w:type="dxa" w:w="1991"/>
+            <w:tcW w:type="dxa" w:w="1975"/>
             <w:tcBorders>
               <w:top w:val="single" w:color="808080" w:sz="4"/>
               <w:left w:val="single" w:color="808080" w:sz="4"/>
@@ -39524,7 +40076,7 @@
         </w:tc>
         <w:tc>
           <w:tcPr>
-            <w:tcW w:type="dxa" w:w="2212"/>
+            <w:tcW w:type="dxa" w:w="2194"/>
             <w:tcBorders>
               <w:top w:val="single" w:color="808080" w:sz="4"/>
               <w:left w:val="single" w:color="808080" w:sz="4"/>
@@ -39559,7 +40111,7 @@
         </w:tc>
         <w:tc>
           <w:tcPr>
-            <w:tcW w:type="dxa" w:w="1403"/>
+            <w:tcW w:type="dxa" w:w="1465"/>
             <w:tcBorders>
               <w:top w:val="single" w:color="808080" w:sz="4"/>
               <w:left w:val="single" w:color="808080" w:sz="4"/>
@@ -39600,7 +40152,7 @@
         </w:trPr>
         <w:tc>
           <w:tcPr>
-            <w:tcW w:type="dxa" w:w="2212"/>
+            <w:tcW w:type="dxa" w:w="2194"/>
             <w:tcBorders>
               <w:top w:val="single" w:color="808080" w:sz="4"/>
               <w:left w:val="single" w:color="808080" w:sz="4"/>
@@ -39635,7 +40187,7 @@
         </w:tc>
         <w:tc>
           <w:tcPr>
-            <w:tcW w:type="dxa" w:w="1253"/>
+            <w:tcW w:type="dxa" w:w="1243"/>
             <w:tcBorders>
               <w:top w:val="single" w:color="808080" w:sz="4"/>
               <w:left w:val="single" w:color="808080" w:sz="4"/>
@@ -39670,7 +40222,7 @@
         </w:tc>
         <w:tc>
           <w:tcPr>
-            <w:tcW w:type="dxa" w:w="1991"/>
+            <w:tcW w:type="dxa" w:w="1975"/>
             <w:tcBorders>
               <w:top w:val="single" w:color="808080" w:sz="4"/>
               <w:left w:val="single" w:color="808080" w:sz="4"/>
@@ -39705,7 +40257,7 @@
         </w:tc>
         <w:tc>
           <w:tcPr>
-            <w:tcW w:type="dxa" w:w="2212"/>
+            <w:tcW w:type="dxa" w:w="2194"/>
             <w:tcBorders>
               <w:top w:val="single" w:color="808080" w:sz="4"/>
               <w:left w:val="single" w:color="808080" w:sz="4"/>
@@ -39740,7 +40292,7 @@
         </w:tc>
         <w:tc>
           <w:tcPr>
-            <w:tcW w:type="dxa" w:w="1403"/>
+            <w:tcW w:type="dxa" w:w="1465"/>
             <w:tcBorders>
               <w:top w:val="single" w:color="808080" w:sz="4"/>
               <w:left w:val="single" w:color="808080" w:sz="4"/>
@@ -39781,7 +40333,7 @@
         </w:trPr>
         <w:tc>
           <w:tcPr>
-            <w:tcW w:type="dxa" w:w="2212"/>
+            <w:tcW w:type="dxa" w:w="2194"/>
             <w:tcBorders>
               <w:top w:val="single" w:color="808080" w:sz="4"/>
               <w:left w:val="single" w:color="808080" w:sz="4"/>
@@ -39816,7 +40368,7 @@
         </w:tc>
         <w:tc>
           <w:tcPr>
-            <w:tcW w:type="dxa" w:w="1253"/>
+            <w:tcW w:type="dxa" w:w="1243"/>
             <w:tcBorders>
               <w:top w:val="single" w:color="808080" w:sz="4"/>
               <w:left w:val="single" w:color="808080" w:sz="4"/>
@@ -39851,7 +40403,7 @@
         </w:tc>
         <w:tc>
           <w:tcPr>
-            <w:tcW w:type="dxa" w:w="1991"/>
+            <w:tcW w:type="dxa" w:w="1975"/>
             <w:tcBorders>
               <w:top w:val="single" w:color="808080" w:sz="4"/>
               <w:left w:val="single" w:color="808080" w:sz="4"/>
@@ -39886,7 +40438,7 @@
         </w:tc>
         <w:tc>
           <w:tcPr>
-            <w:tcW w:type="dxa" w:w="2212"/>
+            <w:tcW w:type="dxa" w:w="2194"/>
             <w:tcBorders>
               <w:top w:val="single" w:color="808080" w:sz="4"/>
               <w:left w:val="single" w:color="808080" w:sz="4"/>
@@ -39921,7 +40473,7 @@
         </w:tc>
         <w:tc>
           <w:tcPr>
-            <w:tcW w:type="dxa" w:w="1403"/>
+            <w:tcW w:type="dxa" w:w="1465"/>
             <w:tcBorders>
               <w:top w:val="single" w:color="808080" w:sz="4"/>
               <w:left w:val="single" w:color="808080" w:sz="4"/>
@@ -39962,7 +40514,7 @@
         </w:trPr>
         <w:tc>
           <w:tcPr>
-            <w:tcW w:type="dxa" w:w="2212"/>
+            <w:tcW w:type="dxa" w:w="2194"/>
             <w:tcBorders>
               <w:top w:val="single" w:color="808080" w:sz="4"/>
               <w:left w:val="single" w:color="808080" w:sz="4"/>
@@ -39997,7 +40549,7 @@
         </w:tc>
         <w:tc>
           <w:tcPr>
-            <w:tcW w:type="dxa" w:w="1253"/>
+            <w:tcW w:type="dxa" w:w="1243"/>
             <w:tcBorders>
               <w:top w:val="single" w:color="808080" w:sz="4"/>
               <w:left w:val="single" w:color="808080" w:sz="4"/>
@@ -40032,7 +40584,7 @@
         </w:tc>
         <w:tc>
           <w:tcPr>
-            <w:tcW w:type="dxa" w:w="1991"/>
+            <w:tcW w:type="dxa" w:w="1975"/>
             <w:tcBorders>
               <w:top w:val="single" w:color="808080" w:sz="4"/>
               <w:left w:val="single" w:color="808080" w:sz="4"/>
@@ -40067,7 +40619,7 @@
         </w:tc>
         <w:tc>
           <w:tcPr>
-            <w:tcW w:type="dxa" w:w="2212"/>
+            <w:tcW w:type="dxa" w:w="2194"/>
             <w:tcBorders>
               <w:top w:val="single" w:color="808080" w:sz="4"/>
               <w:left w:val="single" w:color="808080" w:sz="4"/>
@@ -40102,7 +40654,7 @@
         </w:tc>
         <w:tc>
           <w:tcPr>
-            <w:tcW w:type="dxa" w:w="1403"/>
+            <w:tcW w:type="dxa" w:w="1465"/>
             <w:tcBorders>
               <w:top w:val="single" w:color="808080" w:sz="4"/>
               <w:left w:val="single" w:color="808080" w:sz="4"/>
@@ -40143,7 +40695,7 @@
         </w:trPr>
         <w:tc>
           <w:tcPr>
-            <w:tcW w:type="dxa" w:w="2212"/>
+            <w:tcW w:type="dxa" w:w="2194"/>
             <w:tcBorders>
               <w:top w:val="single" w:color="808080" w:sz="4"/>
               <w:left w:val="single" w:color="808080" w:sz="4"/>
@@ -40178,7 +40730,7 @@
         </w:tc>
         <w:tc>
           <w:tcPr>
-            <w:tcW w:type="dxa" w:w="1253"/>
+            <w:tcW w:type="dxa" w:w="1243"/>
             <w:tcBorders>
               <w:top w:val="single" w:color="808080" w:sz="4"/>
               <w:left w:val="single" w:color="808080" w:sz="4"/>
@@ -40213,7 +40765,7 @@
         </w:tc>
         <w:tc>
           <w:tcPr>
-            <w:tcW w:type="dxa" w:w="1991"/>
+            <w:tcW w:type="dxa" w:w="1975"/>
             <w:tcBorders>
               <w:top w:val="single" w:color="808080" w:sz="4"/>
               <w:left w:val="single" w:color="808080" w:sz="4"/>
@@ -40260,7 +40812,7 @@
         </w:tc>
         <w:tc>
           <w:tcPr>
-            <w:tcW w:type="dxa" w:w="2212"/>
+            <w:tcW w:type="dxa" w:w="2194"/>
             <w:tcBorders>
               <w:top w:val="single" w:color="808080" w:sz="4"/>
               <w:left w:val="single" w:color="808080" w:sz="4"/>
@@ -40295,7 +40847,7 @@
         </w:tc>
         <w:tc>
           <w:tcPr>
-            <w:tcW w:type="dxa" w:w="1403"/>
+            <w:tcW w:type="dxa" w:w="1465"/>
             <w:tcBorders>
               <w:top w:val="single" w:color="808080" w:sz="4"/>
               <w:left w:val="single" w:color="808080" w:sz="4"/>
@@ -40336,7 +40888,7 @@
         </w:trPr>
         <w:tc>
           <w:tcPr>
-            <w:tcW w:type="dxa" w:w="2212"/>
+            <w:tcW w:type="dxa" w:w="2194"/>
             <w:tcBorders>
               <w:top w:val="single" w:color="808080" w:sz="4"/>
               <w:left w:val="single" w:color="808080" w:sz="4"/>
@@ -40371,7 +40923,7 @@
         </w:tc>
         <w:tc>
           <w:tcPr>
-            <w:tcW w:type="dxa" w:w="1253"/>
+            <w:tcW w:type="dxa" w:w="1243"/>
             <w:tcBorders>
               <w:top w:val="single" w:color="808080" w:sz="4"/>
               <w:left w:val="single" w:color="808080" w:sz="4"/>
@@ -40406,7 +40958,7 @@
         </w:tc>
         <w:tc>
           <w:tcPr>
-            <w:tcW w:type="dxa" w:w="1991"/>
+            <w:tcW w:type="dxa" w:w="1975"/>
             <w:tcBorders>
               <w:top w:val="single" w:color="808080" w:sz="4"/>
               <w:left w:val="single" w:color="808080" w:sz="4"/>
@@ -40441,7 +40993,7 @@
         </w:tc>
         <w:tc>
           <w:tcPr>
-            <w:tcW w:type="dxa" w:w="2212"/>
+            <w:tcW w:type="dxa" w:w="2194"/>
             <w:tcBorders>
               <w:top w:val="single" w:color="808080" w:sz="4"/>
               <w:left w:val="single" w:color="808080" w:sz="4"/>
@@ -40476,7 +41028,7 @@
         </w:tc>
         <w:tc>
           <w:tcPr>
-            <w:tcW w:type="dxa" w:w="1403"/>
+            <w:tcW w:type="dxa" w:w="1465"/>
             <w:tcBorders>
               <w:top w:val="single" w:color="808080" w:sz="4"/>
               <w:left w:val="single" w:color="808080" w:sz="4"/>
@@ -40517,7 +41069,7 @@
         </w:trPr>
         <w:tc>
           <w:tcPr>
-            <w:tcW w:type="dxa" w:w="2212"/>
+            <w:tcW w:type="dxa" w:w="2194"/>
             <w:tcBorders>
               <w:top w:val="single" w:color="808080" w:sz="4"/>
               <w:left w:val="single" w:color="808080" w:sz="4"/>
@@ -40552,7 +41104,7 @@
         </w:tc>
         <w:tc>
           <w:tcPr>
-            <w:tcW w:type="dxa" w:w="1253"/>
+            <w:tcW w:type="dxa" w:w="1243"/>
             <w:tcBorders>
               <w:top w:val="single" w:color="808080" w:sz="4"/>
               <w:left w:val="single" w:color="808080" w:sz="4"/>
@@ -40587,7 +41139,7 @@
         </w:tc>
         <w:tc>
           <w:tcPr>
-            <w:tcW w:type="dxa" w:w="1991"/>
+            <w:tcW w:type="dxa" w:w="1975"/>
             <w:tcBorders>
               <w:top w:val="single" w:color="808080" w:sz="4"/>
               <w:left w:val="single" w:color="808080" w:sz="4"/>
@@ -40622,7 +41174,7 @@
         </w:tc>
         <w:tc>
           <w:tcPr>
-            <w:tcW w:type="dxa" w:w="2212"/>
+            <w:tcW w:type="dxa" w:w="2194"/>
             <w:tcBorders>
               <w:top w:val="single" w:color="808080" w:sz="4"/>
               <w:left w:val="single" w:color="808080" w:sz="4"/>
@@ -40657,7 +41209,7 @@
         </w:tc>
         <w:tc>
           <w:tcPr>
-            <w:tcW w:type="dxa" w:w="1403"/>
+            <w:tcW w:type="dxa" w:w="1465"/>
             <w:tcBorders>
               <w:top w:val="single" w:color="808080" w:sz="4"/>
               <w:left w:val="single" w:color="808080" w:sz="4"/>

</xml_diff>